<commit_message>
add: added a code for pre-processing & pipeline code in section 5.1.3
</commit_message>
<xml_diff>
--- a/Check for the requirements.docx
+++ b/Check for the requirements.docx
@@ -10,13 +10,6 @@
       <w:r>
         <w:t>Requirements</w:t>
       </w:r>
-    </w:p>
-    <w:p>
-      <w:pPr>
-        <w:rPr>
-          <w:rFonts w:asciiTheme="majorHAnsi" w:hAnsiTheme="majorHAnsi"/>
-        </w:rPr>
-      </w:pPr>
     </w:p>
     <w:p>
       <w:pPr>
@@ -79,6 +72,7 @@
         <w:t>In the example Excel file:</w:t>
       </w:r>
     </w:p>
+    <w:p/>
     <w:p>
       <w:pPr>
         <w:rPr>
@@ -147,8 +141,10 @@
         <w:t>In the code:</w:t>
       </w:r>
     </w:p>
-    <w:p>
-      <w:pPr>
+    <w:p/>
+    <w:p>
+      <w:pPr>
+        <w:jc w:val="center"/>
         <w:rPr>
           <w:rFonts w:asciiTheme="majorHAnsi" w:hAnsiTheme="majorHAnsi"/>
         </w:rPr>
@@ -158,9 +154,9 @@
           <w:rFonts w:asciiTheme="majorHAnsi" w:hAnsiTheme="majorHAnsi"/>
         </w:rPr>
         <w:drawing>
-          <wp:inline distT="0" distB="0" distL="0" distR="0" wp14:anchorId="431C6308" wp14:editId="3A6FF990">
-            <wp:extent cx="5943600" cy="3916680"/>
-            <wp:effectExtent l="0" t="0" r="0" b="7620"/>
+          <wp:inline distT="0" distB="0" distL="0" distR="0" wp14:anchorId="431C6308" wp14:editId="2B3D3BA6">
+            <wp:extent cx="5047488" cy="3326165"/>
+            <wp:effectExtent l="0" t="0" r="1270" b="7620"/>
             <wp:docPr id="1005992532" name="Picture 1"/>
             <wp:cNvGraphicFramePr>
               <a:graphicFrameLocks xmlns:a="http://schemas.openxmlformats.org/drawingml/2006/main" noChangeAspect="1"/>
@@ -181,7 +177,7 @@
                   <pic:spPr>
                     <a:xfrm>
                       <a:off x="0" y="0"/>
-                      <a:ext cx="5943600" cy="3916680"/>
+                      <a:ext cx="5055783" cy="3331631"/>
                     </a:xfrm>
                     <a:prstGeom prst="rect">
                       <a:avLst/>
@@ -209,20 +205,6 @@
     </w:p>
     <w:p>
       <w:pPr>
-        <w:rPr>
-          <w:rFonts w:asciiTheme="majorHAnsi" w:hAnsiTheme="majorHAnsi"/>
-        </w:rPr>
-      </w:pPr>
-    </w:p>
-    <w:p>
-      <w:pPr>
-        <w:rPr>
-          <w:rFonts w:asciiTheme="majorHAnsi" w:hAnsiTheme="majorHAnsi"/>
-        </w:rPr>
-      </w:pPr>
-    </w:p>
-    <w:p>
-      <w:pPr>
         <w:pStyle w:val="Heading1"/>
         <w:numPr>
           <w:ilvl w:val="0"/>
@@ -307,6 +289,7 @@
         <w:t>In the example Excel File:</w:t>
       </w:r>
     </w:p>
+    <w:p/>
     <w:p>
       <w:pPr>
         <w:rPr>
@@ -379,6 +362,7 @@
         <w:t>In the code:</w:t>
       </w:r>
     </w:p>
+    <w:p/>
     <w:p>
       <w:r>
         <w:drawing>
@@ -420,6 +404,154 @@
     </w:p>
     <w:p/>
     <w:p/>
+    <w:p/>
+    <w:p>
+      <w:pPr>
+        <w:pStyle w:val="Heading2"/>
+        <w:numPr>
+          <w:ilvl w:val="1"/>
+          <w:numId w:val="2"/>
+        </w:numPr>
+      </w:pPr>
+      <w:r>
+        <w:t>INSTALLATION INSTRUCTIONS</w:t>
+      </w:r>
+    </w:p>
+    <w:p>
+      <w:pPr>
+        <w:pStyle w:val="Heading3"/>
+      </w:pPr>
+    </w:p>
+    <w:p>
+      <w:pPr>
+        <w:pStyle w:val="Heading3"/>
+      </w:pPr>
+      <w:r>
+        <w:t>In the example Excel File:</w:t>
+      </w:r>
+    </w:p>
+    <w:p>
+      <w:pPr>
+        <w:rPr>
+          <w:rFonts w:asciiTheme="majorHAnsi" w:hAnsiTheme="majorHAnsi"/>
+        </w:rPr>
+      </w:pPr>
+      <w:r>
+        <w:rPr>
+          <w:rFonts w:asciiTheme="majorHAnsi" w:hAnsiTheme="majorHAnsi"/>
+        </w:rPr>
+        <w:drawing>
+          <wp:inline distT="0" distB="0" distL="0" distR="0" wp14:anchorId="260FF04B" wp14:editId="3C2D078C">
+            <wp:extent cx="5943600" cy="1227455"/>
+            <wp:effectExtent l="0" t="0" r="0" b="0"/>
+            <wp:docPr id="1378578329" name="Picture 1"/>
+            <wp:cNvGraphicFramePr>
+              <a:graphicFrameLocks xmlns:a="http://schemas.openxmlformats.org/drawingml/2006/main" noChangeAspect="1"/>
+            </wp:cNvGraphicFramePr>
+            <a:graphic xmlns:a="http://schemas.openxmlformats.org/drawingml/2006/main">
+              <a:graphicData uri="http://schemas.openxmlformats.org/drawingml/2006/picture">
+                <pic:pic xmlns:pic="http://schemas.openxmlformats.org/drawingml/2006/picture">
+                  <pic:nvPicPr>
+                    <pic:cNvPr id="1378578329" name=""/>
+                    <pic:cNvPicPr/>
+                  </pic:nvPicPr>
+                  <pic:blipFill>
+                    <a:blip r:embed="rId9"/>
+                    <a:stretch>
+                      <a:fillRect/>
+                    </a:stretch>
+                  </pic:blipFill>
+                  <pic:spPr>
+                    <a:xfrm>
+                      <a:off x="0" y="0"/>
+                      <a:ext cx="5943600" cy="1227455"/>
+                    </a:xfrm>
+                    <a:prstGeom prst="rect">
+                      <a:avLst/>
+                    </a:prstGeom>
+                  </pic:spPr>
+                </pic:pic>
+              </a:graphicData>
+            </a:graphic>
+          </wp:inline>
+        </w:drawing>
+      </w:r>
+    </w:p>
+    <w:p>
+      <w:pPr>
+        <w:pStyle w:val="Heading3"/>
+        <w:rPr>
+          <w:rFonts w:asciiTheme="majorHAnsi" w:hAnsiTheme="majorHAnsi"/>
+        </w:rPr>
+      </w:pPr>
+    </w:p>
+    <w:p>
+      <w:pPr>
+        <w:pStyle w:val="Heading3"/>
+        <w:rPr>
+          <w:rFonts w:asciiTheme="majorHAnsi" w:hAnsiTheme="majorHAnsi"/>
+        </w:rPr>
+      </w:pPr>
+      <w:r>
+        <w:rPr>
+          <w:rFonts w:asciiTheme="majorHAnsi" w:hAnsiTheme="majorHAnsi"/>
+        </w:rPr>
+        <w:t>In the code:</w:t>
+      </w:r>
+    </w:p>
+    <w:p/>
+    <w:p>
+      <w:pPr>
+        <w:rPr>
+          <w:b/>
+          <w:bCs/>
+        </w:rPr>
+      </w:pPr>
+      <w:r>
+        <w:t>All the code is in the file</w:t>
+      </w:r>
+      <w:r>
+        <w:rPr>
+          <w:b/>
+          <w:bCs/>
+        </w:rPr>
+        <w:t xml:space="preserve"> </w:t>
+      </w:r>
+      <w:r>
+        <w:rPr>
+          <w:b/>
+          <w:bCs/>
+          <w:i/>
+          <w:iCs/>
+        </w:rPr>
+        <w:t>environment_instructions_existance_check</w:t>
+      </w:r>
+      <w:r>
+        <w:rPr>
+          <w:b/>
+          <w:bCs/>
+          <w:i/>
+          <w:iCs/>
+        </w:rPr>
+        <w:t>.py</w:t>
+      </w:r>
+      <w:r>
+        <w:t xml:space="preserve"> in the </w:t>
+      </w:r>
+      <w:r>
+        <w:rPr>
+          <w:i/>
+          <w:iCs/>
+        </w:rPr>
+        <w:t>utils</w:t>
+      </w:r>
+      <w:r>
+        <w:t xml:space="preserve"> folder</w:t>
+      </w:r>
+      <w:r>
+        <w:t>.</w:t>
+      </w:r>
+    </w:p>
     <w:p>
       <w:pPr>
         <w:ind w:left="360"/>
@@ -610,6 +742,92 @@
     </w:lvl>
   </w:abstractNum>
   <w:abstractNum w:abstractNumId="2" w15:restartNumberingAfterBreak="0">
+    <w:nsid w:val="5ECF027C"/>
+    <w:multiLevelType w:val="multilevel"/>
+    <w:tmpl w:val="0409001F"/>
+    <w:lvl w:ilvl="0">
+      <w:start w:val="1"/>
+      <w:numFmt w:val="decimal"/>
+      <w:lvlText w:val="%1."/>
+      <w:lvlJc w:val="left"/>
+      <w:pPr>
+        <w:ind w:left="360" w:hanging="360"/>
+      </w:pPr>
+    </w:lvl>
+    <w:lvl w:ilvl="1">
+      <w:start w:val="1"/>
+      <w:numFmt w:val="decimal"/>
+      <w:lvlText w:val="%1.%2."/>
+      <w:lvlJc w:val="left"/>
+      <w:pPr>
+        <w:ind w:left="792" w:hanging="432"/>
+      </w:pPr>
+    </w:lvl>
+    <w:lvl w:ilvl="2">
+      <w:start w:val="1"/>
+      <w:numFmt w:val="decimal"/>
+      <w:lvlText w:val="%1.%2.%3."/>
+      <w:lvlJc w:val="left"/>
+      <w:pPr>
+        <w:ind w:left="1224" w:hanging="504"/>
+      </w:pPr>
+    </w:lvl>
+    <w:lvl w:ilvl="3">
+      <w:start w:val="1"/>
+      <w:numFmt w:val="decimal"/>
+      <w:lvlText w:val="%1.%2.%3.%4."/>
+      <w:lvlJc w:val="left"/>
+      <w:pPr>
+        <w:ind w:left="1728" w:hanging="648"/>
+      </w:pPr>
+    </w:lvl>
+    <w:lvl w:ilvl="4">
+      <w:start w:val="1"/>
+      <w:numFmt w:val="decimal"/>
+      <w:lvlText w:val="%1.%2.%3.%4.%5."/>
+      <w:lvlJc w:val="left"/>
+      <w:pPr>
+        <w:ind w:left="2232" w:hanging="792"/>
+      </w:pPr>
+    </w:lvl>
+    <w:lvl w:ilvl="5">
+      <w:start w:val="1"/>
+      <w:numFmt w:val="decimal"/>
+      <w:lvlText w:val="%1.%2.%3.%4.%5.%6."/>
+      <w:lvlJc w:val="left"/>
+      <w:pPr>
+        <w:ind w:left="2736" w:hanging="936"/>
+      </w:pPr>
+    </w:lvl>
+    <w:lvl w:ilvl="6">
+      <w:start w:val="1"/>
+      <w:numFmt w:val="decimal"/>
+      <w:lvlText w:val="%1.%2.%3.%4.%5.%6.%7."/>
+      <w:lvlJc w:val="left"/>
+      <w:pPr>
+        <w:ind w:left="3240" w:hanging="1080"/>
+      </w:pPr>
+    </w:lvl>
+    <w:lvl w:ilvl="7">
+      <w:start w:val="1"/>
+      <w:numFmt w:val="decimal"/>
+      <w:lvlText w:val="%1.%2.%3.%4.%5.%6.%7.%8."/>
+      <w:lvlJc w:val="left"/>
+      <w:pPr>
+        <w:ind w:left="3744" w:hanging="1224"/>
+      </w:pPr>
+    </w:lvl>
+    <w:lvl w:ilvl="8">
+      <w:start w:val="1"/>
+      <w:numFmt w:val="decimal"/>
+      <w:lvlText w:val="%1.%2.%3.%4.%5.%6.%7.%8.%9."/>
+      <w:lvlJc w:val="left"/>
+      <w:pPr>
+        <w:ind w:left="4320" w:hanging="1440"/>
+      </w:pPr>
+    </w:lvl>
+  </w:abstractNum>
+  <w:abstractNum w:abstractNumId="3" w15:restartNumberingAfterBreak="0">
     <w:nsid w:val="63230CC2"/>
     <w:multiLevelType w:val="multilevel"/>
     <w:tmpl w:val="0409001F"/>
@@ -695,7 +913,7 @@
       </w:pPr>
     </w:lvl>
   </w:abstractNum>
-  <w:abstractNum w:abstractNumId="3" w15:restartNumberingAfterBreak="0">
+  <w:abstractNum w:abstractNumId="4" w15:restartNumberingAfterBreak="0">
     <w:nsid w:val="79034AB4"/>
     <w:multiLevelType w:val="multilevel"/>
     <w:tmpl w:val="0409001F"/>
@@ -785,12 +1003,15 @@
     <w:abstractNumId w:val="1"/>
   </w:num>
   <w:num w:numId="2" w16cid:durableId="1754662100">
-    <w:abstractNumId w:val="3"/>
+    <w:abstractNumId w:val="4"/>
   </w:num>
   <w:num w:numId="3" w16cid:durableId="1138456811">
     <w:abstractNumId w:val="0"/>
   </w:num>
   <w:num w:numId="4" w16cid:durableId="1906647294">
+    <w:abstractNumId w:val="3"/>
+  </w:num>
+  <w:num w:numId="5" w16cid:durableId="1842769885">
     <w:abstractNumId w:val="2"/>
   </w:num>
 </w:numbering>

</xml_diff>

<commit_message>
wip: 70% accuracy, just checks the paper appendixes, the ground truth was the output of claude ai after inputing the list given by finn
</commit_message>
<xml_diff>
--- a/Check for the requirements.docx
+++ b/Check for the requirements.docx
@@ -82,6 +82,7 @@
       <w:r>
         <w:rPr>
           <w:rFonts w:asciiTheme="majorHAnsi" w:hAnsiTheme="majorHAnsi"/>
+          <w:noProof/>
         </w:rPr>
         <w:drawing>
           <wp:inline distT="0" distB="0" distL="0" distR="0" wp14:anchorId="3F6E0AEB" wp14:editId="717F70EB">
@@ -152,6 +153,7 @@
       <w:r>
         <w:rPr>
           <w:rFonts w:asciiTheme="majorHAnsi" w:hAnsiTheme="majorHAnsi"/>
+          <w:noProof/>
         </w:rPr>
         <w:drawing>
           <wp:inline distT="0" distB="0" distL="0" distR="0" wp14:anchorId="431C6308" wp14:editId="2B3D3BA6">
@@ -203,6 +205,8 @@
         <w:t>Pre-processing and Pipeline Code</w:t>
       </w:r>
     </w:p>
+    <w:p/>
+    <w:p/>
     <w:p>
       <w:pPr>
         <w:pStyle w:val="Heading1"/>
@@ -297,6 +301,9 @@
         </w:rPr>
       </w:pPr>
       <w:r>
+        <w:rPr>
+          <w:noProof/>
+        </w:rPr>
         <w:drawing>
           <wp:inline distT="0" distB="0" distL="0" distR="0" wp14:anchorId="4C3FA2BE" wp14:editId="3112FA88">
             <wp:extent cx="5943600" cy="725170"/>
@@ -365,6 +372,9 @@
     <w:p/>
     <w:p>
       <w:r>
+        <w:rPr>
+          <w:noProof/>
+        </w:rPr>
         <w:drawing>
           <wp:inline distT="0" distB="0" distL="0" distR="0" wp14:anchorId="1EA618AA" wp14:editId="7C6FD5C0">
             <wp:extent cx="5943600" cy="2620645"/>
@@ -439,6 +449,7 @@
       <w:r>
         <w:rPr>
           <w:rFonts w:asciiTheme="majorHAnsi" w:hAnsiTheme="majorHAnsi"/>
+          <w:noProof/>
         </w:rPr>
         <w:drawing>
           <wp:inline distT="0" distB="0" distL="0" distR="0" wp14:anchorId="260FF04B" wp14:editId="3C2D078C">
@@ -1618,6 +1629,7 @@
   <w:style w:type="character" w:default="1" w:styleId="DefaultParagraphFont">
     <w:name w:val="Default Paragraph Font"/>
     <w:uiPriority w:val="1"/>
+    <w:semiHidden/>
     <w:unhideWhenUsed/>
   </w:style>
   <w:style w:type="table" w:default="1" w:styleId="TableNormal">

</xml_diff>